<commit_message>
style(xr): replace default skybox with polished demo background
- Add lightweight custom demo skybox shader and material
- Assign neutral presentation skybox to TrainingSimulation scene
- Improve headset demo visual polish without changing XR task logic
- Preserve gaze, hand tracking, context inference, QA logging, and adaptive behavior
</commit_message>
<xml_diff>
--- a/docs/lavanya_paper/out/HarmonyXR_GazePose_Context_Paper_20260514.docx
+++ b/docs/lavanya_paper/out/HarmonyXR_GazePose_Context_Paper_20260514.docx
@@ -5,14 +5,8 @@
     <w:p>
       <w:pPr>
         <w:pStyle w:val="Title"/>
-        <w:jc w:val="center"/>
-      </w:pPr>
-      <w:r>
-        <w:rPr>
-          <w:b/>
-          <w:color w:val="142D3C"/>
-          <w:sz w:val="40"/>
-        </w:rPr>
+      </w:pPr>
+      <w:r>
         <w:t xml:space="preserve">HarmonyXR GazePose-Context: Multimodal Context Inference for Adaptive XR Training</w:t>
       </w:r>
     </w:p>
@@ -21,7 +15,7 @@
         <w:pStyle w:val="Author"/>
       </w:pPr>
       <w:r>
-        <w:t xml:space="preserve">Lavanya D.</w:t>
+        <w:t xml:space="preserve">Varun Siddarju, Lavanya D.</w:t>
       </w:r>
     </w:p>
     <w:p>
@@ -46,7 +40,7 @@
         <w:pStyle w:val="FirstParagraph"/>
       </w:pPr>
       <w:r>
-        <w:t xml:space="preserve">Adaptive extended reality (XR) systems require more than object interaction; they require an ability to understand whether a user is focused, distracted, transitioning between steps, or inactive. This paper presents HarmonyXR GazePose-Context, a Unity and Meta Quest proof-of-concept that infers user context during a guided XR sorting task using runtime signals already available in a headset-facing implementation. The system uses a three-layer architecture: sensor abstraction, context inference, and XR app shell adaptation. Runtime evidence was collected from a Quest headset run using Unity console logs, filtered QA evidence, processed CSV tables, and a headset video. The evidence run produced 169 QA metric samples and captured all four target context states: Engaged, Distracted, Transitioning, and Idle. The results support the feasibility of a lightweight, interpretable adaptive XR prototype that uses multimodal context signals to drive user-facing guidance. The work is positioned as a headset-validated proof-of-concept; a formal participant study remains future Phase 4 work.</w:t>
+        <w:t xml:space="preserve">Adaptive extended reality (XR) systems require more than object interaction; they require an ability to understand whether a user is focused, distracted, transitioning between steps, or inactive. This paper presents HarmonyXR GazePose-Context, a Unity and Meta Quest proof-of-concept that infers user context during a guided XR sorting task using runtime signals available in the current headset-facing implementation. The system uses a three-layer architecture: sensor abstraction, context inference, and XR app shell adaptation. Runtime evidence was collected from a Quest headset run using Unity console logs, filtered QA evidence, processed CSV tables, and a headset video. The evidence run produced 169 QA metric samples and captured all four target context states: Engaged, Distracted, Transitioning, and Idle. The results support the feasibility of a lightweight, interpretable adaptive XR prototype that uses multimodal context signals to drive user-facing guidance. The work is positioned as headset-running prototype evidence; a formal participant study remains future Phase 4 work.</w:t>
       </w:r>
     </w:p>
     <w:p>
@@ -130,7 +124,7 @@
         </w:numPr>
       </w:pPr>
       <w:r>
-        <w:t xml:space="preserve">A headset-facing prototype that captures gaze/AOI, spatial context, hand interaction, pinch state, and gaze timing features.</w:t>
+        <w:t xml:space="preserve">A headset-facing prototype that captures gaze/AOI evidence, spatial context, hand interaction, pinch state, and gaze timing features available in the current runtime.</w:t>
       </w:r>
     </w:p>
     <w:p>
@@ -166,11 +160,11 @@
         </w:numPr>
       </w:pPr>
       <w:r>
-        <w:t xml:space="preserve">A validated evidence package containing a headset video, console logs, filtered state evidence, and processed tables.</w:t>
+        <w:t xml:space="preserve">A runtime evidence package containing a headset video, console logs, filtered state evidence, and processed tables.</w:t>
       </w:r>
     </w:p>
     <w:bookmarkEnd w:id="10"/>
-    <w:bookmarkStart w:id="11" w:name="related-work"/>
+    <w:bookmarkStart w:id="16" w:name="related-work"/>
     <w:p>
       <w:pPr>
         <w:pStyle w:val="Heading1"/>
@@ -184,7 +178,24 @@
         <w:pStyle w:val="FirstParagraph"/>
       </w:pPr>
       <w:r>
-        <w:t xml:space="preserve">The paper is positioned across four areas of XR research: gaze and attention in immersive environments, multimodal interaction, posture and hand tracking, and context-aware adaptation.</w:t>
+        <w:t xml:space="preserve">The paper is positioned across five areas of XR research: gaze and attention in immersive environments, multimodal attention detection, body and hand tracking, multimodal XR interaction, and context-aware XR adaptation.</w:t>
+      </w:r>
+    </w:p>
+    <w:bookmarkStart w:id="11" w:name="gaze-tracking-and-attention-in-vr"/>
+    <w:p>
+      <w:pPr>
+        <w:pStyle w:val="Heading2"/>
+      </w:pPr>
+      <w:r>
+        <w:t xml:space="preserve">2.1 Gaze Tracking and Attention in VR</w:t>
+      </w:r>
+    </w:p>
+    <w:p>
+      <w:pPr>
+        <w:pStyle w:val="FirstParagraph"/>
+      </w:pPr>
+      <w:r>
+        <w:t xml:space="preserve">Eye tracking is widely used in VR to estimate attention, object focus, dwell behavior, and gaze-based interaction. Moreno-Arjonilla et al. survey VR eye-tracking hardware, calibration, gaze estimation methods, datasets, and application areas, showing that gaze is a foundational signal for immersive interaction and attention analysis [1]. However, the survey also makes clear that gaze-centric systems do not by themselves capture full user context, because they typically do not integrate body pose, task events, or broader behavioral signals.</w:t>
       </w:r>
     </w:p>
     <w:p>
@@ -192,7 +203,25 @@
         <w:pStyle w:val="BodyText"/>
       </w:pPr>
       <w:r>
-        <w:t xml:space="preserve">Gaze tracking has been widely studied as an indicator of visual attention in VR and XR. Prior surveys and accuracy studies show that gaze can support object selection, attention monitoring, and adaptive interaction, but gaze alone is often insufficient for robust state inference [1], [3], [11]. Multimodal XR research argues that combining input channels can make interaction more robust than relying on a single modality [4], [8]. This motivates the use of gaze/AOI, hand interaction, spatial context, and posture-related signals in the present prototype.</w:t>
+        <w:t xml:space="preserve">Pastel et al. compare gaze accuracy and precision between real-world and VR conditions [2]. Their results show that gaze can be useful in controlled static tasks, but accuracy and precision become more difficult under dynamic conditions. This supports the design decision in HarmonyXR GazePose-Context to avoid relying on gaze/AOI evidence alone and instead combine it with hand, posture, spatial, and task-related signals.</w:t>
+      </w:r>
+    </w:p>
+    <w:bookmarkEnd w:id="11"/>
+    <w:bookmarkStart w:id="12" w:name="multimodal-attention-and-xr-interaction"/>
+    <w:p>
+      <w:pPr>
+        <w:pStyle w:val="Heading2"/>
+      </w:pPr>
+      <w:r>
+        <w:t xml:space="preserve">2.2 Multimodal Attention and XR Interaction</w:t>
+      </w:r>
+    </w:p>
+    <w:p>
+      <w:pPr>
+        <w:pStyle w:val="FirstParagraph"/>
+      </w:pPr>
+      <w:r>
+        <w:t xml:space="preserve">Long et al. demonstrate that multimodal physiological sensing can improve classification of internal and external attention in VR by combining EEG and eye-tracking features [3]. This supports the broader claim that multimodal sensing can improve attention-state inference. At the same time, their approach depends on specialized EEG hardware and uses time windows that are larger than the lightweight runtime loop used in the current prototype. HarmonyXR therefore focuses on behavioral and interaction signals that can be collected inside an XR application without adding brain-computer-interface hardware.</w:t>
       </w:r>
     </w:p>
     <w:p>
@@ -200,7 +229,25 @@
         <w:pStyle w:val="BodyText"/>
       </w:pPr>
       <w:r>
-        <w:t xml:space="preserve">Body and posture recognition also contribute to user-state understanding. Skeleton-based posture recognition and VR body-tracking research show how body motion can support interpretation of physical behavior in interactive environments [5], [6]. Hand tracking and sensor-fusion approaches are relevant because interaction events and pinch state provide behavioral evidence beyond gaze alone [10].</w:t>
+        <w:t xml:space="preserve">Rakkolainen et al. provide a scoping review of multimodal interaction technologies in extended reality, covering gaze, gestures, speech, haptics, physiological sensing, and other modalities [4]. Kim et al. later analyze the chronological shift from controller-based interaction toward hand, gaze, wrist, voice, and multimodal input across XR device generations [5]. Together, these reviews show that XR interaction is moving toward multimodal input, but they also highlight a gap between collecting multiple input channels and using those channels for real-time behavioral context inference.</w:t>
+      </w:r>
+    </w:p>
+    <w:bookmarkEnd w:id="12"/>
+    <w:bookmarkStart w:id="13" w:name="body-head-and-hand-tracking"/>
+    <w:p>
+      <w:pPr>
+        <w:pStyle w:val="Heading2"/>
+      </w:pPr>
+      <w:r>
+        <w:t xml:space="preserve">2.3 Body, Head, and Hand Tracking</w:t>
+      </w:r>
+    </w:p>
+    <w:p>
+      <w:pPr>
+        <w:pStyle w:val="FirstParagraph"/>
+      </w:pPr>
+      <w:r>
+        <w:t xml:space="preserve">Body and posture signals provide useful evidence about user behavior beyond visual attention. Bustamante et al. show that skeleton-based posture recognition can classify standing, sitting, and lying using lightweight geometric heuristics [6]. Neidhardt et al. show that head-mounted XR tracking can provide useful evidence about body movement during VR-based musculoskeletal training [7]. These works support the use of posture and movement signals, but they focus mainly on physical-state estimation rather than combining pose with gaze/AOI and task-state evidence for adaptive XR behavior.</w:t>
       </w:r>
     </w:p>
     <w:p>
@@ -208,11 +255,56 @@
         <w:pStyle w:val="BodyText"/>
       </w:pPr>
       <w:r>
-        <w:t xml:space="preserve">Context-aware XR systems adapt interface behavior according to task, environment, or user context [7], [9]. However, many systems treat context as externally defined rather than inferred from live behavior. HarmonyXR GazePose-Context contributes a practical, interpretable implementation that links runtime signals to adaptive XR behavior during a concrete task.</w:t>
-      </w:r>
-    </w:p>
-    <w:bookmarkEnd w:id="11"/>
-    <w:bookmarkStart w:id="12" w:name="research-problem-and-scope"/>
+        <w:t xml:space="preserve">Hand interaction is another important behavioral signal in XR because it indicates whether the user is actively manipulating or approaching task objects. Lei et al. propose a sensor-fusion approach for precise hand tracking in VR using multiple sensing sources and temporal modeling [8]. Their work focuses on improving hand-tracking accuracy, while HarmonyXR uses hand and pinch evidence as part of a higher-level context inference model.</w:t>
+      </w:r>
+    </w:p>
+    <w:bookmarkEnd w:id="13"/>
+    <w:bookmarkStart w:id="14" w:name="X30a93fde7b11cb8e4bf2e2ffe1bc13a71744d3d"/>
+    <w:p>
+      <w:pPr>
+        <w:pStyle w:val="Heading2"/>
+      </w:pPr>
+      <w:r>
+        <w:t xml:space="preserve">2.4 Gaze-Based Feedback and Context-Aware Adaptation</w:t>
+      </w:r>
+    </w:p>
+    <w:p>
+      <w:pPr>
+        <w:pStyle w:val="FirstParagraph"/>
+      </w:pPr>
+      <w:r>
+        <w:t xml:space="preserve">Selaskowski et al. present gaze-based attention refocusing training in VR for adults with ADHD [9]. Their system uses gaze behavior to trigger feedback when attention shifts away from a continuous performance task, while also collecting EEG, head movement, and performance measures for analysis. This work is relevant because it shows how gaze behavior can drive real-time feedback, but its online decision logic remains primarily gaze-based rather than a fused multimodal context model.</w:t>
+      </w:r>
+    </w:p>
+    <w:p>
+      <w:pPr>
+        <w:pStyle w:val="BodyText"/>
+      </w:pPr>
+      <w:r>
+        <w:t xml:space="preserve">Davari and Bowman propose a design space for context-aware XR interfaces and evaluate an adaptive placement strategy for XR content [10]. Their work demonstrates the importance of context-aware adaptation for usability and cognitive load, but the context reasoning is primarily about interface placement and environmental relevance. Ramiotis and Mania propose CONTEXT-GAD, a context-aware adaptive dwell model that combines gaze behavior, head rotation, interaction frequency, and scene context to adapt gaze dwell thresholds [11]. This shows that recent XR research is moving from gaze-only interaction toward context-aware adaptation, but the adaptation remains centered on gaze selection rather than general user-context inference.</w:t>
+      </w:r>
+    </w:p>
+    <w:bookmarkEnd w:id="14"/>
+    <w:bookmarkStart w:id="15" w:name="research-gap"/>
+    <w:p>
+      <w:pPr>
+        <w:pStyle w:val="Heading2"/>
+      </w:pPr>
+      <w:r>
+        <w:t xml:space="preserve">2.5 Research Gap</w:t>
+      </w:r>
+    </w:p>
+    <w:p>
+      <w:pPr>
+        <w:pStyle w:val="FirstParagraph"/>
+      </w:pPr>
+      <w:r>
+        <w:t xml:space="preserve">Existing XR research shows strong progress in gaze tracking, multimodal sensing, body/posture recognition, hand tracking, and context-aware interface adaptation. However, these strands are often treated separately: gaze systems focus on attention or selection, posture systems focus on body-state classification, hand-tracking systems focus on tracking accuracy, and context-aware XR systems often adapt placement or feedback based on narrow context definitions. HarmonyXR GazePose-Context addresses this gap at prototype level by combining runtime gaze/AOI evidence, hand interaction, posture or spatial context, and task-related signals into an interpretable four-state context model that drives adaptive XR support.</w:t>
+      </w:r>
+    </w:p>
+    <w:bookmarkEnd w:id="15"/>
+    <w:bookmarkEnd w:id="16"/>
+    <w:bookmarkStart w:id="17" w:name="research-problem-and-scope"/>
     <w:p>
       <w:pPr>
         <w:pStyle w:val="Heading1"/>
@@ -373,8 +465,8 @@
         <w:t xml:space="preserve">Baseline-versus-adaptive participant comparison.</w:t>
       </w:r>
     </w:p>
-    <w:bookmarkEnd w:id="12"/>
-    <w:bookmarkStart w:id="19" w:name="system-overview"/>
+    <w:bookmarkEnd w:id="17"/>
+    <w:bookmarkStart w:id="24" w:name="system-overview"/>
     <w:p>
       <w:pPr>
         <w:pStyle w:val="Heading1"/>
@@ -394,25 +486,24 @@
     <w:p>
       <w:pPr>
         <w:pStyle w:val="CaptionedFigure"/>
-        <w:jc w:val="center"/>
       </w:pPr>
       <w:r>
         <w:drawing>
           <wp:inline>
             <wp:extent cx="5334000" cy="2333625"/>
             <wp:effectExtent b="0" l="0" r="0" t="0"/>
-            <wp:docPr descr="Runtime pipeline" title="" id="14" name="Picture"/>
+            <wp:docPr descr="HarmonyXR GazePose-Context runtime pipeline." title="" id="19" name="Picture"/>
             <a:graphic>
               <a:graphicData uri="http://schemas.openxmlformats.org/drawingml/2006/picture">
                 <pic:pic>
                   <pic:nvPicPr>
-                    <pic:cNvPr descr="figures/figure1_runtime_pipeline.png" id="15" name="Picture"/>
+                    <pic:cNvPr descr="figures/figure1_runtime_pipeline.png" id="20" name="Picture"/>
                     <pic:cNvPicPr>
                       <a:picLocks noChangeArrowheads="1" noChangeAspect="1"/>
                     </pic:cNvPicPr>
                   </pic:nvPicPr>
                   <pic:blipFill>
-                    <a:blip r:embed="rId13"/>
+                    <a:blip r:embed="rId18"/>
                     <a:stretch>
                       <a:fillRect/>
                     </a:stretch>
@@ -444,42 +535,10 @@
         <w:pStyle w:val="ImageCaption"/>
       </w:pPr>
       <w:r>
-        <w:t xml:space="preserve">Runtime pipeline</w:t>
-      </w:r>
-    </w:p>
-    <w:p>
-      <w:pPr>
-        <w:pStyle w:val="BodyText"/>
-        <w:jc w:val="center"/>
-      </w:pPr>
-      <w:r>
-        <w:rPr>
-          <w:b/>
-          <w:bCs/>
-          <w:i/>
-          <w:color w:val="464646"/>
-          <w:sz w:val="18"/>
-        </w:rPr>
-        <w:t xml:space="preserve">Figure 1.</w:t>
-      </w:r>
-      <w:r>
-        <w:rPr>
-          <w:i/>
-          <w:color w:val="464646"/>
-          <w:sz w:val="18"/>
-        </w:rPr>
-        <w:t xml:space="preserve"> </w:t>
-      </w:r>
-      <w:r>
-        <w:rPr>
-          <w:i/>
-          <w:color w:val="464646"/>
-          <w:sz w:val="18"/>
-        </w:rPr>
         <w:t xml:space="preserve">HarmonyXR GazePose-Context runtime pipeline.</w:t>
       </w:r>
     </w:p>
-    <w:bookmarkStart w:id="16" w:name="layer-1-sensor-abstraction"/>
+    <w:bookmarkStart w:id="21" w:name="layer-1-sensor-abstraction"/>
     <w:p>
       <w:pPr>
         <w:pStyle w:val="Heading2"/>
@@ -496,8 +555,8 @@
         <w:t xml:space="preserve">The sensor abstraction layer converts headset and scene signals into runtime fields. Relevant fields include AOI, posture or spatial posture context, boundary mode, fixation duration, dwell ratio, saccade rate, body activity, hand interaction count, pinch state, and distance to task object. These are emitted through QA metrics and logged for validation.</w:t>
       </w:r>
     </w:p>
-    <w:bookmarkEnd w:id="16"/>
-    <w:bookmarkStart w:id="17" w:name="layer-2-context-engine"/>
+    <w:bookmarkEnd w:id="21"/>
+    <w:bookmarkStart w:id="22" w:name="layer-2-context-engine"/>
     <w:p>
       <w:pPr>
         <w:pStyle w:val="Heading2"/>
@@ -514,8 +573,8 @@
         <w:t xml:space="preserve">The context engine consumes the synchronized signal frame and infers a context state. The current implementation uses interpretable rule-based logic and confidence values rather than a black-box model. This design keeps the proof-of-concept explainable for research and stakeholder review.</w:t>
       </w:r>
     </w:p>
-    <w:bookmarkEnd w:id="17"/>
-    <w:bookmarkStart w:id="18" w:name="layer-3-xr-app-shell"/>
+    <w:bookmarkEnd w:id="22"/>
+    <w:bookmarkStart w:id="23" w:name="layer-3-xr-app-shell"/>
     <w:p>
       <w:pPr>
         <w:pStyle w:val="Heading2"/>
@@ -532,9 +591,9 @@
         <w:t xml:space="preserve">The XR app shell translates inferred state into visible user support. It includes onboarding, task guidance, context-aware feedback, adaptive support actions, QA/evidence logging, and end-of-session completion messaging.</w:t>
       </w:r>
     </w:p>
-    <w:bookmarkEnd w:id="18"/>
-    <w:bookmarkEnd w:id="19"/>
-    <w:bookmarkStart w:id="20" w:name="prototype-implementation"/>
+    <w:bookmarkEnd w:id="23"/>
+    <w:bookmarkEnd w:id="24"/>
+    <w:bookmarkStart w:id="25" w:name="prototype-implementation"/>
     <w:p>
       <w:pPr>
         <w:pStyle w:val="Heading1"/>
@@ -677,8 +736,8 @@
         <w:t xml:space="preserve">The proof-of-concept intentionally stays within a narrow research scope. It does not add unrelated gameplay or study-management systems. The goal is to show that adaptive XR behavior can be driven by inferred context signals during a simple task.</w:t>
       </w:r>
     </w:p>
-    <w:bookmarkEnd w:id="20"/>
-    <w:bookmarkStart w:id="21" w:name="context-state-model"/>
+    <w:bookmarkEnd w:id="25"/>
+    <w:bookmarkStart w:id="26" w:name="context-state-model"/>
     <w:p>
       <w:pPr>
         <w:pStyle w:val="Heading1"/>
@@ -775,8 +834,8 @@
         <w:t xml:space="preserve">These states are used as runtime categories for adaptive behavior and evidence reporting. They are not clinical or psychological diagnoses.</w:t>
       </w:r>
     </w:p>
-    <w:bookmarkEnd w:id="21"/>
-    <w:bookmarkStart w:id="22" w:name="evidence-collection-method"/>
+    <w:bookmarkEnd w:id="26"/>
+    <w:bookmarkStart w:id="27" w:name="evidence-collection-method"/>
     <w:p>
       <w:pPr>
         <w:pStyle w:val="Heading1"/>
@@ -926,8 +985,8 @@
         <w:t xml:space="preserve">The evidence run produced 169 QA metric samples. Each QA metric line contained state, confidence, boundary, AOI, posture/spatial context, fixation, dwell, saccade, body activity, hand interaction count, pinch state, and distance to task object.</w:t>
       </w:r>
     </w:p>
-    <w:bookmarkEnd w:id="22"/>
-    <w:bookmarkStart w:id="30" w:name="results"/>
+    <w:bookmarkEnd w:id="27"/>
+    <w:bookmarkStart w:id="35" w:name="results"/>
     <w:p>
       <w:pPr>
         <w:pStyle w:val="Heading1"/>
@@ -936,7 +995,7 @@
         <w:t xml:space="preserve">8. Results</w:t>
       </w:r>
     </w:p>
-    <w:bookmarkStart w:id="26" w:name="context-state-coverage"/>
+    <w:bookmarkStart w:id="31" w:name="context-state-coverage"/>
     <w:p>
       <w:pPr>
         <w:pStyle w:val="Heading2"/>
@@ -957,7 +1016,6 @@
       <w:tblPr>
         <w:tblStyle w:val="Table"/>
         <w:tblW w:type="auto" w:w="0"/>
-        <w:jc w:val="center"/>
         <w:tblLook w:firstRow="1" w:lastRow="0" w:firstColumn="0" w:lastColumn="0" w:noHBand="0" w:noVBand="0" w:val="0020"/>
       </w:tblPr>
       <w:tblGrid>
@@ -972,97 +1030,57 @@
           <w:tblHeader w:val="on"/>
         </w:trPr>
         <w:tc>
-          <w:tcPr>
-            <w:vAlign w:val="center"/>
-          </w:tcPr>
-          <w:p>
-            <w:pPr>
-              <w:pStyle w:val="Compact"/>
-              <w:spacing w:after="40"/>
-            </w:pPr>
-            <w:r>
-              <w:rPr>
-                <w:b/>
-                <w:color w:val="142D3C"/>
-                <w:sz w:val="18"/>
-              </w:rPr>
+          <w:tcPr/>
+          <w:p>
+            <w:pPr>
+              <w:pStyle w:val="Compact"/>
+            </w:pPr>
+            <w:r>
               <w:t xml:space="preserve">State</w:t>
             </w:r>
           </w:p>
         </w:tc>
         <w:tc>
-          <w:tcPr>
-            <w:vAlign w:val="center"/>
-          </w:tcPr>
-          <w:p>
-            <w:pPr>
-              <w:pStyle w:val="Compact"/>
-              <w:spacing w:after="40"/>
+          <w:tcPr/>
+          <w:p>
+            <w:pPr>
+              <w:pStyle w:val="Compact"/>
               <w:jc w:val="right"/>
             </w:pPr>
             <w:r>
-              <w:rPr>
-                <w:b/>
-                <w:color w:val="142D3C"/>
-                <w:sz w:val="18"/>
-              </w:rPr>
               <w:t xml:space="preserve">Samples</w:t>
             </w:r>
           </w:p>
         </w:tc>
         <w:tc>
-          <w:tcPr>
-            <w:vAlign w:val="center"/>
-          </w:tcPr>
-          <w:p>
-            <w:pPr>
-              <w:pStyle w:val="Compact"/>
-              <w:spacing w:after="40"/>
-            </w:pPr>
-            <w:r>
-              <w:rPr>
-                <w:b/>
-                <w:color w:val="142D3C"/>
-                <w:sz w:val="18"/>
-              </w:rPr>
+          <w:tcPr/>
+          <w:p>
+            <w:pPr>
+              <w:pStyle w:val="Compact"/>
+            </w:pPr>
+            <w:r>
               <w:t xml:space="preserve">First timestamp</w:t>
             </w:r>
           </w:p>
         </w:tc>
         <w:tc>
-          <w:tcPr>
-            <w:vAlign w:val="center"/>
-          </w:tcPr>
-          <w:p>
-            <w:pPr>
-              <w:pStyle w:val="Compact"/>
-              <w:spacing w:after="40"/>
-            </w:pPr>
-            <w:r>
-              <w:rPr>
-                <w:b/>
-                <w:color w:val="142D3C"/>
-                <w:sz w:val="18"/>
-              </w:rPr>
+          <w:tcPr/>
+          <w:p>
+            <w:pPr>
+              <w:pStyle w:val="Compact"/>
+            </w:pPr>
+            <w:r>
               <w:t xml:space="preserve">Last timestamp</w:t>
             </w:r>
           </w:p>
         </w:tc>
         <w:tc>
-          <w:tcPr>
-            <w:vAlign w:val="center"/>
-          </w:tcPr>
-          <w:p>
-            <w:pPr>
-              <w:pStyle w:val="Compact"/>
-              <w:spacing w:after="40"/>
-            </w:pPr>
-            <w:r>
-              <w:rPr>
-                <w:b/>
-                <w:color w:val="142D3C"/>
-                <w:sz w:val="18"/>
-              </w:rPr>
+          <w:tcPr/>
+          <w:p>
+            <w:pPr>
+              <w:pStyle w:val="Compact"/>
+            </w:pPr>
+            <w:r>
               <w:t xml:space="preserve">Found</w:t>
             </w:r>
           </w:p>
@@ -1070,87 +1088,57 @@
       </w:tr>
       <w:tr>
         <w:tc>
-          <w:tcPr>
-            <w:vAlign w:val="center"/>
-          </w:tcPr>
-          <w:p>
-            <w:pPr>
-              <w:pStyle w:val="Compact"/>
-              <w:spacing w:after="40"/>
-            </w:pPr>
-            <w:r>
-              <w:rPr>
-                <w:sz w:val="18"/>
-              </w:rPr>
+          <w:tcPr/>
+          <w:p>
+            <w:pPr>
+              <w:pStyle w:val="Compact"/>
+            </w:pPr>
+            <w:r>
               <w:t xml:space="preserve">Engaged</w:t>
             </w:r>
           </w:p>
         </w:tc>
         <w:tc>
-          <w:tcPr>
-            <w:vAlign w:val="center"/>
-          </w:tcPr>
-          <w:p>
-            <w:pPr>
-              <w:pStyle w:val="Compact"/>
-              <w:spacing w:after="40"/>
+          <w:tcPr/>
+          <w:p>
+            <w:pPr>
+              <w:pStyle w:val="Compact"/>
               <w:jc w:val="right"/>
             </w:pPr>
             <w:r>
-              <w:rPr>
-                <w:sz w:val="18"/>
-              </w:rPr>
               <w:t xml:space="preserve">15</w:t>
             </w:r>
           </w:p>
         </w:tc>
         <w:tc>
-          <w:tcPr>
-            <w:vAlign w:val="center"/>
-          </w:tcPr>
-          <w:p>
-            <w:pPr>
-              <w:pStyle w:val="Compact"/>
-              <w:spacing w:after="40"/>
-            </w:pPr>
-            <w:r>
-              <w:rPr>
-                <w:sz w:val="18"/>
-              </w:rPr>
+          <w:tcPr/>
+          <w:p>
+            <w:pPr>
+              <w:pStyle w:val="Compact"/>
+            </w:pPr>
+            <w:r>
               <w:t xml:space="preserve">05-14 16:19:18.956</w:t>
             </w:r>
           </w:p>
         </w:tc>
         <w:tc>
-          <w:tcPr>
-            <w:vAlign w:val="center"/>
-          </w:tcPr>
-          <w:p>
-            <w:pPr>
-              <w:pStyle w:val="Compact"/>
-              <w:spacing w:after="40"/>
-            </w:pPr>
-            <w:r>
-              <w:rPr>
-                <w:sz w:val="18"/>
-              </w:rPr>
+          <w:tcPr/>
+          <w:p>
+            <w:pPr>
+              <w:pStyle w:val="Compact"/>
+            </w:pPr>
+            <w:r>
               <w:t xml:space="preserve">05-14 16:21:33.401</w:t>
             </w:r>
           </w:p>
         </w:tc>
         <w:tc>
-          <w:tcPr>
-            <w:vAlign w:val="center"/>
-          </w:tcPr>
-          <w:p>
-            <w:pPr>
-              <w:pStyle w:val="Compact"/>
-              <w:spacing w:after="40"/>
-            </w:pPr>
-            <w:r>
-              <w:rPr>
-                <w:sz w:val="18"/>
-              </w:rPr>
+          <w:tcPr/>
+          <w:p>
+            <w:pPr>
+              <w:pStyle w:val="Compact"/>
+            </w:pPr>
+            <w:r>
               <w:t xml:space="preserve">Yes</w:t>
             </w:r>
           </w:p>
@@ -1158,87 +1146,57 @@
       </w:tr>
       <w:tr>
         <w:tc>
-          <w:tcPr>
-            <w:vAlign w:val="center"/>
-          </w:tcPr>
-          <w:p>
-            <w:pPr>
-              <w:pStyle w:val="Compact"/>
-              <w:spacing w:after="40"/>
-            </w:pPr>
-            <w:r>
-              <w:rPr>
-                <w:sz w:val="18"/>
-              </w:rPr>
+          <w:tcPr/>
+          <w:p>
+            <w:pPr>
+              <w:pStyle w:val="Compact"/>
+            </w:pPr>
+            <w:r>
               <w:t xml:space="preserve">Distracted</w:t>
             </w:r>
           </w:p>
         </w:tc>
         <w:tc>
-          <w:tcPr>
-            <w:vAlign w:val="center"/>
-          </w:tcPr>
-          <w:p>
-            <w:pPr>
-              <w:pStyle w:val="Compact"/>
-              <w:spacing w:after="40"/>
+          <w:tcPr/>
+          <w:p>
+            <w:pPr>
+              <w:pStyle w:val="Compact"/>
               <w:jc w:val="right"/>
             </w:pPr>
             <w:r>
-              <w:rPr>
-                <w:sz w:val="18"/>
-              </w:rPr>
               <w:t xml:space="preserve">30</w:t>
             </w:r>
           </w:p>
         </w:tc>
         <w:tc>
-          <w:tcPr>
-            <w:vAlign w:val="center"/>
-          </w:tcPr>
-          <w:p>
-            <w:pPr>
-              <w:pStyle w:val="Compact"/>
-              <w:spacing w:after="40"/>
-            </w:pPr>
-            <w:r>
-              <w:rPr>
-                <w:sz w:val="18"/>
-              </w:rPr>
+          <w:tcPr/>
+          <w:p>
+            <w:pPr>
+              <w:pStyle w:val="Compact"/>
+            </w:pPr>
+            <w:r>
               <w:t xml:space="preserve">05-14 16:16:46.104</w:t>
             </w:r>
           </w:p>
         </w:tc>
         <w:tc>
-          <w:tcPr>
-            <w:vAlign w:val="center"/>
-          </w:tcPr>
-          <w:p>
-            <w:pPr>
-              <w:pStyle w:val="Compact"/>
-              <w:spacing w:after="40"/>
-            </w:pPr>
-            <w:r>
-              <w:rPr>
-                <w:sz w:val="18"/>
-              </w:rPr>
+          <w:tcPr/>
+          <w:p>
+            <w:pPr>
+              <w:pStyle w:val="Compact"/>
+            </w:pPr>
+            <w:r>
               <w:t xml:space="preserve">05-14 16:21:55.453</w:t>
             </w:r>
           </w:p>
         </w:tc>
         <w:tc>
-          <w:tcPr>
-            <w:vAlign w:val="center"/>
-          </w:tcPr>
-          <w:p>
-            <w:pPr>
-              <w:pStyle w:val="Compact"/>
-              <w:spacing w:after="40"/>
-            </w:pPr>
-            <w:r>
-              <w:rPr>
-                <w:sz w:val="18"/>
-              </w:rPr>
+          <w:tcPr/>
+          <w:p>
+            <w:pPr>
+              <w:pStyle w:val="Compact"/>
+            </w:pPr>
+            <w:r>
               <w:t xml:space="preserve">Yes</w:t>
             </w:r>
           </w:p>
@@ -1246,87 +1204,57 @@
       </w:tr>
       <w:tr>
         <w:tc>
-          <w:tcPr>
-            <w:vAlign w:val="center"/>
-          </w:tcPr>
-          <w:p>
-            <w:pPr>
-              <w:pStyle w:val="Compact"/>
-              <w:spacing w:after="40"/>
-            </w:pPr>
-            <w:r>
-              <w:rPr>
-                <w:sz w:val="18"/>
-              </w:rPr>
+          <w:tcPr/>
+          <w:p>
+            <w:pPr>
+              <w:pStyle w:val="Compact"/>
+            </w:pPr>
+            <w:r>
               <w:t xml:space="preserve">Transitioning</w:t>
             </w:r>
           </w:p>
         </w:tc>
         <w:tc>
-          <w:tcPr>
-            <w:vAlign w:val="center"/>
-          </w:tcPr>
-          <w:p>
-            <w:pPr>
-              <w:pStyle w:val="Compact"/>
-              <w:spacing w:after="40"/>
+          <w:tcPr/>
+          <w:p>
+            <w:pPr>
+              <w:pStyle w:val="Compact"/>
               <w:jc w:val="right"/>
             </w:pPr>
             <w:r>
-              <w:rPr>
-                <w:sz w:val="18"/>
-              </w:rPr>
               <w:t xml:space="preserve">100</w:t>
             </w:r>
           </w:p>
         </w:tc>
         <w:tc>
-          <w:tcPr>
-            <w:vAlign w:val="center"/>
-          </w:tcPr>
-          <w:p>
-            <w:pPr>
-              <w:pStyle w:val="Compact"/>
-              <w:spacing w:after="40"/>
-            </w:pPr>
-            <w:r>
-              <w:rPr>
-                <w:sz w:val="18"/>
-              </w:rPr>
+          <w:tcPr/>
+          <w:p>
+            <w:pPr>
+              <w:pStyle w:val="Compact"/>
+            </w:pPr>
+            <w:r>
               <w:t xml:space="preserve">05-14 16:19:28.044</w:t>
             </w:r>
           </w:p>
         </w:tc>
         <w:tc>
-          <w:tcPr>
-            <w:vAlign w:val="center"/>
-          </w:tcPr>
-          <w:p>
-            <w:pPr>
-              <w:pStyle w:val="Compact"/>
-              <w:spacing w:after="40"/>
-            </w:pPr>
-            <w:r>
-              <w:rPr>
-                <w:sz w:val="18"/>
-              </w:rPr>
+          <w:tcPr/>
+          <w:p>
+            <w:pPr>
+              <w:pStyle w:val="Compact"/>
+            </w:pPr>
+            <w:r>
               <w:t xml:space="preserve">05-14 16:21:48.434</w:t>
             </w:r>
           </w:p>
         </w:tc>
         <w:tc>
-          <w:tcPr>
-            <w:vAlign w:val="center"/>
-          </w:tcPr>
-          <w:p>
-            <w:pPr>
-              <w:pStyle w:val="Compact"/>
-              <w:spacing w:after="40"/>
-            </w:pPr>
-            <w:r>
-              <w:rPr>
-                <w:sz w:val="18"/>
-              </w:rPr>
+          <w:tcPr/>
+          <w:p>
+            <w:pPr>
+              <w:pStyle w:val="Compact"/>
+            </w:pPr>
+            <w:r>
               <w:t xml:space="preserve">Yes</w:t>
             </w:r>
           </w:p>
@@ -1334,87 +1262,57 @@
       </w:tr>
       <w:tr>
         <w:tc>
-          <w:tcPr>
-            <w:vAlign w:val="center"/>
-          </w:tcPr>
-          <w:p>
-            <w:pPr>
-              <w:pStyle w:val="Compact"/>
-              <w:spacing w:after="40"/>
-            </w:pPr>
-            <w:r>
-              <w:rPr>
-                <w:sz w:val="18"/>
-              </w:rPr>
+          <w:tcPr/>
+          <w:p>
+            <w:pPr>
+              <w:pStyle w:val="Compact"/>
+            </w:pPr>
+            <w:r>
               <w:t xml:space="preserve">Idle</w:t>
             </w:r>
           </w:p>
         </w:tc>
         <w:tc>
-          <w:tcPr>
-            <w:vAlign w:val="center"/>
-          </w:tcPr>
-          <w:p>
-            <w:pPr>
-              <w:pStyle w:val="Compact"/>
-              <w:spacing w:after="40"/>
+          <w:tcPr/>
+          <w:p>
+            <w:pPr>
+              <w:pStyle w:val="Compact"/>
               <w:jc w:val="right"/>
             </w:pPr>
             <w:r>
-              <w:rPr>
-                <w:sz w:val="18"/>
-              </w:rPr>
               <w:t xml:space="preserve">24</w:t>
             </w:r>
           </w:p>
         </w:tc>
         <w:tc>
-          <w:tcPr>
-            <w:vAlign w:val="center"/>
-          </w:tcPr>
-          <w:p>
-            <w:pPr>
-              <w:pStyle w:val="Compact"/>
-              <w:spacing w:after="40"/>
-            </w:pPr>
-            <w:r>
-              <w:rPr>
-                <w:sz w:val="18"/>
-              </w:rPr>
+          <w:tcPr/>
+          <w:p>
+            <w:pPr>
+              <w:pStyle w:val="Compact"/>
+            </w:pPr>
+            <w:r>
               <w:t xml:space="preserve">05-14 16:16:49.126</w:t>
             </w:r>
           </w:p>
         </w:tc>
         <w:tc>
-          <w:tcPr>
-            <w:vAlign w:val="center"/>
-          </w:tcPr>
-          <w:p>
-            <w:pPr>
-              <w:pStyle w:val="Compact"/>
-              <w:spacing w:after="40"/>
-            </w:pPr>
-            <w:r>
-              <w:rPr>
-                <w:sz w:val="18"/>
-              </w:rPr>
+          <w:tcPr/>
+          <w:p>
+            <w:pPr>
+              <w:pStyle w:val="Compact"/>
+            </w:pPr>
+            <w:r>
               <w:t xml:space="preserve">05-14 16:22:02.470</w:t>
             </w:r>
           </w:p>
         </w:tc>
         <w:tc>
-          <w:tcPr>
-            <w:vAlign w:val="center"/>
-          </w:tcPr>
-          <w:p>
-            <w:pPr>
-              <w:pStyle w:val="Compact"/>
-              <w:spacing w:after="40"/>
-            </w:pPr>
-            <w:r>
-              <w:rPr>
-                <w:sz w:val="18"/>
-              </w:rPr>
+          <w:tcPr/>
+          <w:p>
+            <w:pPr>
+              <w:pStyle w:val="Compact"/>
+            </w:pPr>
+            <w:r>
               <w:t xml:space="preserve">Yes</w:t>
             </w:r>
           </w:p>
@@ -1424,25 +1322,24 @@
     <w:p>
       <w:pPr>
         <w:pStyle w:val="CaptionedFigure"/>
-        <w:jc w:val="center"/>
       </w:pPr>
       <w:r>
         <w:drawing>
           <wp:inline>
             <wp:extent cx="5334000" cy="3124200"/>
             <wp:effectExtent b="0" l="0" r="0" t="0"/>
-            <wp:docPr descr="State coverage" title="" id="24" name="Picture"/>
+            <wp:docPr descr="Context state sample counts observed in the headset evidence run." title="" id="29" name="Picture"/>
             <a:graphic>
               <a:graphicData uri="http://schemas.openxmlformats.org/drawingml/2006/picture">
                 <pic:pic>
                   <pic:nvPicPr>
-                    <pic:cNvPr descr="figures/figure2_state_coverage.png" id="25" name="Picture"/>
+                    <pic:cNvPr descr="figures/figure2_state_coverage.png" id="30" name="Picture"/>
                     <pic:cNvPicPr>
                       <a:picLocks noChangeArrowheads="1" noChangeAspect="1"/>
                     </pic:cNvPicPr>
                   </pic:nvPicPr>
                   <pic:blipFill>
-                    <a:blip r:embed="rId23"/>
+                    <a:blip r:embed="rId28"/>
                     <a:stretch>
                       <a:fillRect/>
                     </a:stretch>
@@ -1474,43 +1371,11 @@
         <w:pStyle w:val="ImageCaption"/>
       </w:pPr>
       <w:r>
-        <w:t xml:space="preserve">State coverage</w:t>
-      </w:r>
-    </w:p>
-    <w:p>
-      <w:pPr>
-        <w:pStyle w:val="BodyText"/>
-        <w:jc w:val="center"/>
-      </w:pPr>
-      <w:r>
-        <w:rPr>
-          <w:b/>
-          <w:bCs/>
-          <w:i/>
-          <w:color w:val="464646"/>
-          <w:sz w:val="18"/>
-        </w:rPr>
-        <w:t xml:space="preserve">Figure 2.</w:t>
-      </w:r>
-      <w:r>
-        <w:rPr>
-          <w:i/>
-          <w:color w:val="464646"/>
-          <w:sz w:val="18"/>
-        </w:rPr>
-        <w:t xml:space="preserve"> </w:t>
-      </w:r>
-      <w:r>
-        <w:rPr>
-          <w:i/>
-          <w:color w:val="464646"/>
-          <w:sz w:val="18"/>
-        </w:rPr>
         <w:t xml:space="preserve">Context state sample counts observed in the headset evidence run.</w:t>
       </w:r>
     </w:p>
-    <w:bookmarkEnd w:id="26"/>
-    <w:bookmarkStart w:id="27" w:name="runtime-signal-coverage"/>
+    <w:bookmarkEnd w:id="31"/>
+    <w:bookmarkStart w:id="32" w:name="runtime-signal-coverage"/>
     <w:p>
       <w:pPr>
         <w:pStyle w:val="Heading2"/>
@@ -1531,7 +1396,6 @@
       <w:tblPr>
         <w:tblStyle w:val="Table"/>
         <w:tblW w:type="pct" w:w="5000"/>
-        <w:jc w:val="center"/>
         <w:tblLayout w:type="fixed"/>
         <w:tblLook w:firstRow="1" w:lastRow="0" w:firstColumn="0" w:lastColumn="0" w:noHBand="0" w:noVBand="0" w:val="0020"/>
       </w:tblPr>
@@ -1545,58 +1409,34 @@
           <w:tblHeader w:val="on"/>
         </w:trPr>
         <w:tc>
-          <w:tcPr>
-            <w:vAlign w:val="center"/>
-          </w:tcPr>
-          <w:p>
-            <w:pPr>
-              <w:pStyle w:val="Compact"/>
-              <w:spacing w:after="40"/>
-            </w:pPr>
-            <w:r>
-              <w:rPr>
-                <w:b/>
-                <w:color w:val="142D3C"/>
-                <w:sz w:val="18"/>
-              </w:rPr>
+          <w:tcPr/>
+          <w:p>
+            <w:pPr>
+              <w:pStyle w:val="Compact"/>
+            </w:pPr>
+            <w:r>
               <w:t xml:space="preserve">Signal field</w:t>
             </w:r>
           </w:p>
         </w:tc>
         <w:tc>
-          <w:tcPr>
-            <w:vAlign w:val="center"/>
-          </w:tcPr>
-          <w:p>
-            <w:pPr>
-              <w:pStyle w:val="Compact"/>
-              <w:spacing w:after="40"/>
-            </w:pPr>
-            <w:r>
-              <w:rPr>
-                <w:b/>
-                <w:color w:val="142D3C"/>
-                <w:sz w:val="18"/>
-              </w:rPr>
+          <w:tcPr/>
+          <w:p>
+            <w:pPr>
+              <w:pStyle w:val="Compact"/>
+            </w:pPr>
+            <w:r>
               <w:t xml:space="preserve">Status</w:t>
             </w:r>
           </w:p>
         </w:tc>
         <w:tc>
-          <w:tcPr>
-            <w:vAlign w:val="center"/>
-          </w:tcPr>
-          <w:p>
-            <w:pPr>
-              <w:pStyle w:val="Compact"/>
-              <w:spacing w:after="40"/>
-            </w:pPr>
-            <w:r>
-              <w:rPr>
-                <w:b/>
-                <w:color w:val="142D3C"/>
-                <w:sz w:val="18"/>
-              </w:rPr>
+          <w:tcPr/>
+          <w:p>
+            <w:pPr>
+              <w:pStyle w:val="Compact"/>
+            </w:pPr>
+            <w:r>
               <w:t xml:space="preserve">Evidence source</w:t>
             </w:r>
           </w:p>
@@ -1604,52 +1444,34 @@
       </w:tr>
       <w:tr>
         <w:tc>
-          <w:tcPr>
-            <w:vAlign w:val="center"/>
-          </w:tcPr>
-          <w:p>
-            <w:pPr>
-              <w:pStyle w:val="Compact"/>
-              <w:spacing w:after="40"/>
-            </w:pPr>
-            <w:r>
-              <w:rPr>
-                <w:sz w:val="18"/>
-              </w:rPr>
+          <w:tcPr/>
+          <w:p>
+            <w:pPr>
+              <w:pStyle w:val="Compact"/>
+            </w:pPr>
+            <w:r>
               <w:t xml:space="preserve">AOI</w:t>
             </w:r>
           </w:p>
         </w:tc>
         <w:tc>
-          <w:tcPr>
-            <w:vAlign w:val="center"/>
-          </w:tcPr>
-          <w:p>
-            <w:pPr>
-              <w:pStyle w:val="Compact"/>
-              <w:spacing w:after="40"/>
-            </w:pPr>
-            <w:r>
-              <w:rPr>
-                <w:sz w:val="18"/>
-              </w:rPr>
+          <w:tcPr/>
+          <w:p>
+            <w:pPr>
+              <w:pStyle w:val="Compact"/>
+            </w:pPr>
+            <w:r>
               <w:t xml:space="preserve">Present in QA_METRICS</w:t>
             </w:r>
           </w:p>
         </w:tc>
         <w:tc>
-          <w:tcPr>
-            <w:vAlign w:val="center"/>
-          </w:tcPr>
-          <w:p>
-            <w:pPr>
-              <w:pStyle w:val="Compact"/>
-              <w:spacing w:after="40"/>
-            </w:pPr>
-            <w:r>
-              <w:rPr>
-                <w:sz w:val="18"/>
-              </w:rPr>
+          <w:tcPr/>
+          <w:p>
+            <w:pPr>
+              <w:pStyle w:val="Compact"/>
+            </w:pPr>
+            <w:r>
               <w:t xml:space="preserve">Runtime console log and qa_metrics_extract.csv</w:t>
             </w:r>
           </w:p>
@@ -1657,52 +1479,34 @@
       </w:tr>
       <w:tr>
         <w:tc>
-          <w:tcPr>
-            <w:vAlign w:val="center"/>
-          </w:tcPr>
-          <w:p>
-            <w:pPr>
-              <w:pStyle w:val="Compact"/>
-              <w:spacing w:after="40"/>
-            </w:pPr>
-            <w:r>
-              <w:rPr>
-                <w:sz w:val="18"/>
-              </w:rPr>
+          <w:tcPr/>
+          <w:p>
+            <w:pPr>
+              <w:pStyle w:val="Compact"/>
+            </w:pPr>
+            <w:r>
               <w:t xml:space="preserve">POSTURE</w:t>
             </w:r>
           </w:p>
         </w:tc>
         <w:tc>
-          <w:tcPr>
-            <w:vAlign w:val="center"/>
-          </w:tcPr>
-          <w:p>
-            <w:pPr>
-              <w:pStyle w:val="Compact"/>
-              <w:spacing w:after="40"/>
-            </w:pPr>
-            <w:r>
-              <w:rPr>
-                <w:sz w:val="18"/>
-              </w:rPr>
+          <w:tcPr/>
+          <w:p>
+            <w:pPr>
+              <w:pStyle w:val="Compact"/>
+            </w:pPr>
+            <w:r>
               <w:t xml:space="preserve">Present in QA_METRICS</w:t>
             </w:r>
           </w:p>
         </w:tc>
         <w:tc>
-          <w:tcPr>
-            <w:vAlign w:val="center"/>
-          </w:tcPr>
-          <w:p>
-            <w:pPr>
-              <w:pStyle w:val="Compact"/>
-              <w:spacing w:after="40"/>
-            </w:pPr>
-            <w:r>
-              <w:rPr>
-                <w:sz w:val="18"/>
-              </w:rPr>
+          <w:tcPr/>
+          <w:p>
+            <w:pPr>
+              <w:pStyle w:val="Compact"/>
+            </w:pPr>
+            <w:r>
               <w:t xml:space="preserve">Runtime console log and qa_metrics_extract.csv</w:t>
             </w:r>
           </w:p>
@@ -1710,52 +1514,34 @@
       </w:tr>
       <w:tr>
         <w:tc>
-          <w:tcPr>
-            <w:vAlign w:val="center"/>
-          </w:tcPr>
-          <w:p>
-            <w:pPr>
-              <w:pStyle w:val="Compact"/>
-              <w:spacing w:after="40"/>
-            </w:pPr>
-            <w:r>
-              <w:rPr>
-                <w:sz w:val="18"/>
-              </w:rPr>
+          <w:tcPr/>
+          <w:p>
+            <w:pPr>
+              <w:pStyle w:val="Compact"/>
+            </w:pPr>
+            <w:r>
               <w:t xml:space="preserve">BOUND</w:t>
             </w:r>
           </w:p>
         </w:tc>
         <w:tc>
-          <w:tcPr>
-            <w:vAlign w:val="center"/>
-          </w:tcPr>
-          <w:p>
-            <w:pPr>
-              <w:pStyle w:val="Compact"/>
-              <w:spacing w:after="40"/>
-            </w:pPr>
-            <w:r>
-              <w:rPr>
-                <w:sz w:val="18"/>
-              </w:rPr>
+          <w:tcPr/>
+          <w:p>
+            <w:pPr>
+              <w:pStyle w:val="Compact"/>
+            </w:pPr>
+            <w:r>
               <w:t xml:space="preserve">Present in QA_METRICS</w:t>
             </w:r>
           </w:p>
         </w:tc>
         <w:tc>
-          <w:tcPr>
-            <w:vAlign w:val="center"/>
-          </w:tcPr>
-          <w:p>
-            <w:pPr>
-              <w:pStyle w:val="Compact"/>
-              <w:spacing w:after="40"/>
-            </w:pPr>
-            <w:r>
-              <w:rPr>
-                <w:sz w:val="18"/>
-              </w:rPr>
+          <w:tcPr/>
+          <w:p>
+            <w:pPr>
+              <w:pStyle w:val="Compact"/>
+            </w:pPr>
+            <w:r>
               <w:t xml:space="preserve">Runtime console log and qa_metrics_extract.csv</w:t>
             </w:r>
           </w:p>
@@ -1763,52 +1549,34 @@
       </w:tr>
       <w:tr>
         <w:tc>
-          <w:tcPr>
-            <w:vAlign w:val="center"/>
-          </w:tcPr>
-          <w:p>
-            <w:pPr>
-              <w:pStyle w:val="Compact"/>
-              <w:spacing w:after="40"/>
-            </w:pPr>
-            <w:r>
-              <w:rPr>
-                <w:sz w:val="18"/>
-              </w:rPr>
+          <w:tcPr/>
+          <w:p>
+            <w:pPr>
+              <w:pStyle w:val="Compact"/>
+            </w:pPr>
+            <w:r>
               <w:t xml:space="preserve">FIX</w:t>
             </w:r>
           </w:p>
         </w:tc>
         <w:tc>
-          <w:tcPr>
-            <w:vAlign w:val="center"/>
-          </w:tcPr>
-          <w:p>
-            <w:pPr>
-              <w:pStyle w:val="Compact"/>
-              <w:spacing w:after="40"/>
-            </w:pPr>
-            <w:r>
-              <w:rPr>
-                <w:sz w:val="18"/>
-              </w:rPr>
+          <w:tcPr/>
+          <w:p>
+            <w:pPr>
+              <w:pStyle w:val="Compact"/>
+            </w:pPr>
+            <w:r>
               <w:t xml:space="preserve">Present in QA_METRICS</w:t>
             </w:r>
           </w:p>
         </w:tc>
         <w:tc>
-          <w:tcPr>
-            <w:vAlign w:val="center"/>
-          </w:tcPr>
-          <w:p>
-            <w:pPr>
-              <w:pStyle w:val="Compact"/>
-              <w:spacing w:after="40"/>
-            </w:pPr>
-            <w:r>
-              <w:rPr>
-                <w:sz w:val="18"/>
-              </w:rPr>
+          <w:tcPr/>
+          <w:p>
+            <w:pPr>
+              <w:pStyle w:val="Compact"/>
+            </w:pPr>
+            <w:r>
               <w:t xml:space="preserve">Runtime console log and qa_metrics_extract.csv</w:t>
             </w:r>
           </w:p>
@@ -1816,52 +1584,34 @@
       </w:tr>
       <w:tr>
         <w:tc>
-          <w:tcPr>
-            <w:vAlign w:val="center"/>
-          </w:tcPr>
-          <w:p>
-            <w:pPr>
-              <w:pStyle w:val="Compact"/>
-              <w:spacing w:after="40"/>
-            </w:pPr>
-            <w:r>
-              <w:rPr>
-                <w:sz w:val="18"/>
-              </w:rPr>
+          <w:tcPr/>
+          <w:p>
+            <w:pPr>
+              <w:pStyle w:val="Compact"/>
+            </w:pPr>
+            <w:r>
               <w:t xml:space="preserve">DWELL</w:t>
             </w:r>
           </w:p>
         </w:tc>
         <w:tc>
-          <w:tcPr>
-            <w:vAlign w:val="center"/>
-          </w:tcPr>
-          <w:p>
-            <w:pPr>
-              <w:pStyle w:val="Compact"/>
-              <w:spacing w:after="40"/>
-            </w:pPr>
-            <w:r>
-              <w:rPr>
-                <w:sz w:val="18"/>
-              </w:rPr>
+          <w:tcPr/>
+          <w:p>
+            <w:pPr>
+              <w:pStyle w:val="Compact"/>
+            </w:pPr>
+            <w:r>
               <w:t xml:space="preserve">Present in QA_METRICS</w:t>
             </w:r>
           </w:p>
         </w:tc>
         <w:tc>
-          <w:tcPr>
-            <w:vAlign w:val="center"/>
-          </w:tcPr>
-          <w:p>
-            <w:pPr>
-              <w:pStyle w:val="Compact"/>
-              <w:spacing w:after="40"/>
-            </w:pPr>
-            <w:r>
-              <w:rPr>
-                <w:sz w:val="18"/>
-              </w:rPr>
+          <w:tcPr/>
+          <w:p>
+            <w:pPr>
+              <w:pStyle w:val="Compact"/>
+            </w:pPr>
+            <w:r>
               <w:t xml:space="preserve">Runtime console log and qa_metrics_extract.csv</w:t>
             </w:r>
           </w:p>
@@ -1869,52 +1619,34 @@
       </w:tr>
       <w:tr>
         <w:tc>
-          <w:tcPr>
-            <w:vAlign w:val="center"/>
-          </w:tcPr>
-          <w:p>
-            <w:pPr>
-              <w:pStyle w:val="Compact"/>
-              <w:spacing w:after="40"/>
-            </w:pPr>
-            <w:r>
-              <w:rPr>
-                <w:sz w:val="18"/>
-              </w:rPr>
+          <w:tcPr/>
+          <w:p>
+            <w:pPr>
+              <w:pStyle w:val="Compact"/>
+            </w:pPr>
+            <w:r>
               <w:t xml:space="preserve">SACC</w:t>
             </w:r>
           </w:p>
         </w:tc>
         <w:tc>
-          <w:tcPr>
-            <w:vAlign w:val="center"/>
-          </w:tcPr>
-          <w:p>
-            <w:pPr>
-              <w:pStyle w:val="Compact"/>
-              <w:spacing w:after="40"/>
-            </w:pPr>
-            <w:r>
-              <w:rPr>
-                <w:sz w:val="18"/>
-              </w:rPr>
+          <w:tcPr/>
+          <w:p>
+            <w:pPr>
+              <w:pStyle w:val="Compact"/>
+            </w:pPr>
+            <w:r>
               <w:t xml:space="preserve">Present in QA_METRICS</w:t>
             </w:r>
           </w:p>
         </w:tc>
         <w:tc>
-          <w:tcPr>
-            <w:vAlign w:val="center"/>
-          </w:tcPr>
-          <w:p>
-            <w:pPr>
-              <w:pStyle w:val="Compact"/>
-              <w:spacing w:after="40"/>
-            </w:pPr>
-            <w:r>
-              <w:rPr>
-                <w:sz w:val="18"/>
-              </w:rPr>
+          <w:tcPr/>
+          <w:p>
+            <w:pPr>
+              <w:pStyle w:val="Compact"/>
+            </w:pPr>
+            <w:r>
               <w:t xml:space="preserve">Runtime console log and qa_metrics_extract.csv</w:t>
             </w:r>
           </w:p>
@@ -1922,52 +1654,34 @@
       </w:tr>
       <w:tr>
         <w:tc>
-          <w:tcPr>
-            <w:vAlign w:val="center"/>
-          </w:tcPr>
-          <w:p>
-            <w:pPr>
-              <w:pStyle w:val="Compact"/>
-              <w:spacing w:after="40"/>
-            </w:pPr>
-            <w:r>
-              <w:rPr>
-                <w:sz w:val="18"/>
-              </w:rPr>
+          <w:tcPr/>
+          <w:p>
+            <w:pPr>
+              <w:pStyle w:val="Compact"/>
+            </w:pPr>
+            <w:r>
               <w:t xml:space="preserve">BODY</w:t>
             </w:r>
           </w:p>
         </w:tc>
         <w:tc>
-          <w:tcPr>
-            <w:vAlign w:val="center"/>
-          </w:tcPr>
-          <w:p>
-            <w:pPr>
-              <w:pStyle w:val="Compact"/>
-              <w:spacing w:after="40"/>
-            </w:pPr>
-            <w:r>
-              <w:rPr>
-                <w:sz w:val="18"/>
-              </w:rPr>
+          <w:tcPr/>
+          <w:p>
+            <w:pPr>
+              <w:pStyle w:val="Compact"/>
+            </w:pPr>
+            <w:r>
               <w:t xml:space="preserve">Present in QA_METRICS</w:t>
             </w:r>
           </w:p>
         </w:tc>
         <w:tc>
-          <w:tcPr>
-            <w:vAlign w:val="center"/>
-          </w:tcPr>
-          <w:p>
-            <w:pPr>
-              <w:pStyle w:val="Compact"/>
-              <w:spacing w:after="40"/>
-            </w:pPr>
-            <w:r>
-              <w:rPr>
-                <w:sz w:val="18"/>
-              </w:rPr>
+          <w:tcPr/>
+          <w:p>
+            <w:pPr>
+              <w:pStyle w:val="Compact"/>
+            </w:pPr>
+            <w:r>
               <w:t xml:space="preserve">Runtime console log and qa_metrics_extract.csv</w:t>
             </w:r>
           </w:p>
@@ -1975,52 +1689,34 @@
       </w:tr>
       <w:tr>
         <w:tc>
-          <w:tcPr>
-            <w:vAlign w:val="center"/>
-          </w:tcPr>
-          <w:p>
-            <w:pPr>
-              <w:pStyle w:val="Compact"/>
-              <w:spacing w:after="40"/>
-            </w:pPr>
-            <w:r>
-              <w:rPr>
-                <w:sz w:val="18"/>
-              </w:rPr>
+          <w:tcPr/>
+          <w:p>
+            <w:pPr>
+              <w:pStyle w:val="Compact"/>
+            </w:pPr>
+            <w:r>
               <w:t xml:space="preserve">HAND</w:t>
             </w:r>
           </w:p>
         </w:tc>
         <w:tc>
-          <w:tcPr>
-            <w:vAlign w:val="center"/>
-          </w:tcPr>
-          <w:p>
-            <w:pPr>
-              <w:pStyle w:val="Compact"/>
-              <w:spacing w:after="40"/>
-            </w:pPr>
-            <w:r>
-              <w:rPr>
-                <w:sz w:val="18"/>
-              </w:rPr>
+          <w:tcPr/>
+          <w:p>
+            <w:pPr>
+              <w:pStyle w:val="Compact"/>
+            </w:pPr>
+            <w:r>
               <w:t xml:space="preserve">Present in QA_METRICS</w:t>
             </w:r>
           </w:p>
         </w:tc>
         <w:tc>
-          <w:tcPr>
-            <w:vAlign w:val="center"/>
-          </w:tcPr>
-          <w:p>
-            <w:pPr>
-              <w:pStyle w:val="Compact"/>
-              <w:spacing w:after="40"/>
-            </w:pPr>
-            <w:r>
-              <w:rPr>
-                <w:sz w:val="18"/>
-              </w:rPr>
+          <w:tcPr/>
+          <w:p>
+            <w:pPr>
+              <w:pStyle w:val="Compact"/>
+            </w:pPr>
+            <w:r>
               <w:t xml:space="preserve">Runtime console log and qa_metrics_extract.csv</w:t>
             </w:r>
           </w:p>
@@ -2028,52 +1724,34 @@
       </w:tr>
       <w:tr>
         <w:tc>
-          <w:tcPr>
-            <w:vAlign w:val="center"/>
-          </w:tcPr>
-          <w:p>
-            <w:pPr>
-              <w:pStyle w:val="Compact"/>
-              <w:spacing w:after="40"/>
-            </w:pPr>
-            <w:r>
-              <w:rPr>
-                <w:sz w:val="18"/>
-              </w:rPr>
+          <w:tcPr/>
+          <w:p>
+            <w:pPr>
+              <w:pStyle w:val="Compact"/>
+            </w:pPr>
+            <w:r>
               <w:t xml:space="preserve">PINCH</w:t>
             </w:r>
           </w:p>
         </w:tc>
         <w:tc>
-          <w:tcPr>
-            <w:vAlign w:val="center"/>
-          </w:tcPr>
-          <w:p>
-            <w:pPr>
-              <w:pStyle w:val="Compact"/>
-              <w:spacing w:after="40"/>
-            </w:pPr>
-            <w:r>
-              <w:rPr>
-                <w:sz w:val="18"/>
-              </w:rPr>
+          <w:tcPr/>
+          <w:p>
+            <w:pPr>
+              <w:pStyle w:val="Compact"/>
+            </w:pPr>
+            <w:r>
               <w:t xml:space="preserve">Present in QA_METRICS</w:t>
             </w:r>
           </w:p>
         </w:tc>
         <w:tc>
-          <w:tcPr>
-            <w:vAlign w:val="center"/>
-          </w:tcPr>
-          <w:p>
-            <w:pPr>
-              <w:pStyle w:val="Compact"/>
-              <w:spacing w:after="40"/>
-            </w:pPr>
-            <w:r>
-              <w:rPr>
-                <w:sz w:val="18"/>
-              </w:rPr>
+          <w:tcPr/>
+          <w:p>
+            <w:pPr>
+              <w:pStyle w:val="Compact"/>
+            </w:pPr>
+            <w:r>
               <w:t xml:space="preserve">Runtime console log and qa_metrics_extract.csv</w:t>
             </w:r>
           </w:p>
@@ -2081,60 +1759,42 @@
       </w:tr>
       <w:tr>
         <w:tc>
-          <w:tcPr>
-            <w:vAlign w:val="center"/>
-          </w:tcPr>
-          <w:p>
-            <w:pPr>
-              <w:pStyle w:val="Compact"/>
-              <w:spacing w:after="40"/>
-            </w:pPr>
-            <w:r>
-              <w:rPr>
-                <w:sz w:val="18"/>
-              </w:rPr>
+          <w:tcPr/>
+          <w:p>
+            <w:pPr>
+              <w:pStyle w:val="Compact"/>
+            </w:pPr>
+            <w:r>
               <w:t xml:space="preserve">DIST</w:t>
             </w:r>
           </w:p>
         </w:tc>
         <w:tc>
-          <w:tcPr>
-            <w:vAlign w:val="center"/>
-          </w:tcPr>
-          <w:p>
-            <w:pPr>
-              <w:pStyle w:val="Compact"/>
-              <w:spacing w:after="40"/>
-            </w:pPr>
-            <w:r>
-              <w:rPr>
-                <w:sz w:val="18"/>
-              </w:rPr>
+          <w:tcPr/>
+          <w:p>
+            <w:pPr>
+              <w:pStyle w:val="Compact"/>
+            </w:pPr>
+            <w:r>
               <w:t xml:space="preserve">Present in QA_METRICS</w:t>
             </w:r>
           </w:p>
         </w:tc>
         <w:tc>
-          <w:tcPr>
-            <w:vAlign w:val="center"/>
-          </w:tcPr>
-          <w:p>
-            <w:pPr>
-              <w:pStyle w:val="Compact"/>
-              <w:spacing w:after="40"/>
-            </w:pPr>
-            <w:r>
-              <w:rPr>
-                <w:sz w:val="18"/>
-              </w:rPr>
+          <w:tcPr/>
+          <w:p>
+            <w:pPr>
+              <w:pStyle w:val="Compact"/>
+            </w:pPr>
+            <w:r>
               <w:t xml:space="preserve">Runtime console log and qa_metrics_extract.csv</w:t>
             </w:r>
           </w:p>
         </w:tc>
       </w:tr>
     </w:tbl>
-    <w:bookmarkEnd w:id="27"/>
-    <w:bookmarkStart w:id="28" w:name="adaptive-behavior-evidence"/>
+    <w:bookmarkEnd w:id="32"/>
+    <w:bookmarkStart w:id="33" w:name="adaptive-behavior-evidence"/>
     <w:p>
       <w:pPr>
         <w:pStyle w:val="Heading2"/>
@@ -2148,11 +1808,11 @@
         <w:pStyle w:val="FirstParagraph"/>
       </w:pPr>
       <w:r>
-        <w:t xml:space="preserve">The adaptation evidence table records each trigger state and its expected adaptive response category. Engaged maps to normal task support, Distracted maps to refocus or attention guidance, Transitioning maps to soft movement or task-step support, and Idle maps to pause or adaptive support behavior. The current evidence validates that the trigger states are emitted during headset runtime. Visual confirmation is supported by the full headset evidence video.</w:t>
-      </w:r>
-    </w:p>
-    <w:bookmarkEnd w:id="28"/>
-    <w:bookmarkStart w:id="29" w:name="stability-evidence"/>
+        <w:t xml:space="preserve">The adaptation evidence table records each trigger state and its expected adaptive response category. Engaged maps to normal task support, Distracted maps to refocus or attention guidance, Transitioning maps to soft movement or task-step support, and Idle maps to pause or adaptive support behavior. The current evidence shows that the trigger states are emitted during headset runtime. Visual confirmation is supported by the full headset evidence video. This evidence should be interpreted as runtime behavior proof, not as a controlled measurement of user benefit.</w:t>
+      </w:r>
+    </w:p>
+    <w:bookmarkEnd w:id="33"/>
+    <w:bookmarkStart w:id="34" w:name="stability-evidence"/>
     <w:p>
       <w:pPr>
         <w:pStyle w:val="Heading2"/>
@@ -2166,12 +1826,12 @@
         <w:pStyle w:val="FirstParagraph"/>
       </w:pPr>
       <w:r>
-        <w:t xml:space="preserve">The run captured QA metric output from 05-14 16:16:46.104 through 05-14 16:22:02.470. No crash was indicated in the captured evidence, and the QA metric stream continued during the run. Hardware QA latency under 200 ms was reported separately as passed.</w:t>
-      </w:r>
-    </w:p>
-    <w:bookmarkEnd w:id="29"/>
-    <w:bookmarkEnd w:id="30"/>
-    <w:bookmarkStart w:id="31" w:name="discussion"/>
+        <w:t xml:space="preserve">The run captured QA metric output from 05-14 16:16:46.104 through 05-14 16:22:02.470. No crash was indicated in the captured evidence, and the QA metric stream continued during the run. The available evidence therefore supports runtime continuity during the captured session. A more detailed latency analysis with explicit measured values should be added before making a strong real-time performance claim.</w:t>
+      </w:r>
+    </w:p>
+    <w:bookmarkEnd w:id="34"/>
+    <w:bookmarkEnd w:id="35"/>
+    <w:bookmarkStart w:id="36" w:name="discussion"/>
     <w:p>
       <w:pPr>
         <w:pStyle w:val="Heading1"/>
@@ -2185,7 +1845,7 @@
         <w:pStyle w:val="FirstParagraph"/>
       </w:pPr>
       <w:r>
-        <w:t xml:space="preserve">The evidence supports the central claim that a headset-running XR prototype can infer and expose user context using lightweight multimodal signals. The presence of all four context states demonstrates that the model is reachable across the expected behavioral conditions. The signal coverage table demonstrates that the runtime records enough evidence to support analysis of gaze/AOI, posture or spatial posture context, hand interaction, pinch state, and gaze-derived timing features.</w:t>
+        <w:t xml:space="preserve">The evidence supports the central claim that a headset-running XR prototype can infer and expose user context using lightweight multimodal runtime signals. The presence of all four context states demonstrates that the model is reachable across the expected behavioral conditions. This does not by itself prove classification accuracy, because no participant ground truth or independent annotation is included in the current evidence package. The signal coverage table demonstrates that the runtime records enough evidence to support analysis of gaze/AOI, posture or spatial posture context, hand interaction, pinch state, and gaze-derived timing features.</w:t>
       </w:r>
     </w:p>
     <w:p>
@@ -2196,8 +1856,8 @@
         <w:t xml:space="preserve">The communication improvements in the app shell are also important. Earlier versions of the prototype risked appearing like a technical debug demo. The current presentation better explains the research purpose, active task, inferred state, and adaptive support. This matters because the proof-of-concept is intended for first-time users, clients, and research stakeholders, not only developers.</w:t>
       </w:r>
     </w:p>
-    <w:bookmarkEnd w:id="31"/>
-    <w:bookmarkStart w:id="32" w:name="limitations"/>
+    <w:bookmarkEnd w:id="36"/>
+    <w:bookmarkStart w:id="37" w:name="limitations"/>
     <w:p>
       <w:pPr>
         <w:pStyle w:val="Heading1"/>
@@ -2219,7 +1879,7 @@
         <w:pStyle w:val="BodyText"/>
       </w:pPr>
       <w:r>
-        <w:t xml:space="preserve">Several implementation boundaries should be noted. The</w:t>
+        <w:t xml:space="preserve">Several implementation boundaries should be noted. The current paper uses gaze/AOI evidence as recorded by the runtime and does not claim a completed participant-calibrated eye-tracking accuracy study. The</w:t>
       </w:r>
       <w:r>
         <w:t xml:space="preserve"> </w:t>
@@ -2237,8 +1897,8 @@
         <w:t xml:space="preserve">posture value should be interpreted as spatial or boundary context, not strict sitting/standing recognition. Sitting or standing should only be discussed where explicit sitting or standing values appear in the logs. The current context log format is JSONL-style runtime evidence rather than a single JSON array document. Some guide-level QA requirements, such as formal participant self-report ground truth and baseline/adaptive comparisons, remain Phase 4 work.</w:t>
       </w:r>
     </w:p>
-    <w:bookmarkEnd w:id="32"/>
-    <w:bookmarkStart w:id="33" w:name="future-work"/>
+    <w:bookmarkEnd w:id="37"/>
+    <w:bookmarkStart w:id="38" w:name="future-work"/>
     <w:p>
       <w:pPr>
         <w:pStyle w:val="Heading1"/>
@@ -2255,8 +1915,8 @@
         <w:t xml:space="preserve">Future Phase 4 work should conduct a formal within-subjects study comparing baseline and adaptive conditions. The planned study should collect task completion time, sorting errors, context detection accuracy against ground truth, and subjective workload. Additional future work may include richer locomotion modeling, face tracking, EEG or physiological signals, multi-user context modeling, and personalization of inference thresholds.</w:t>
       </w:r>
     </w:p>
-    <w:bookmarkEnd w:id="33"/>
-    <w:bookmarkStart w:id="34" w:name="conclusion"/>
+    <w:bookmarkEnd w:id="38"/>
+    <w:bookmarkStart w:id="39" w:name="conclusion"/>
     <w:p>
       <w:pPr>
         <w:pStyle w:val="Heading1"/>
@@ -2273,8 +1933,8 @@
         <w:t xml:space="preserve">HarmonyXR GazePose-Context demonstrates a working adaptive XR proof-of-concept that infers user context from runtime signals and uses that context to support task guidance. The headset evidence package confirms all four target states and 169 QA metric samples containing key signal fields. While formal Phase 4 participant evaluation remains future work, the current implementation provides a credible systems prototype and evidence base for an adaptive XR research paper.</w:t>
       </w:r>
     </w:p>
-    <w:bookmarkEnd w:id="34"/>
-    <w:bookmarkStart w:id="35" w:name="acknowledgment-and-disclosure"/>
+    <w:bookmarkEnd w:id="39"/>
+    <w:bookmarkStart w:id="40" w:name="acknowledgment-and-disclosure"/>
     <w:p>
       <w:pPr>
         <w:pStyle w:val="Heading1"/>
@@ -2291,8 +1951,8 @@
         <w:t xml:space="preserve">This draft was prepared from the current OpenSpatialAI implementation, HarmonyXR planning documents, and the May 14, 2026 evidence package. AI-assisted development and documentation tools were used during project work; final submission should include the disclosure wording required by the target venue.</w:t>
       </w:r>
     </w:p>
-    <w:bookmarkEnd w:id="35"/>
-    <w:bookmarkStart w:id="36" w:name="references"/>
+    <w:bookmarkEnd w:id="40"/>
+    <w:bookmarkStart w:id="41" w:name="references"/>
     <w:p>
       <w:pPr>
         <w:pStyle w:val="Heading1"/>
@@ -2306,13 +1966,13 @@
         <w:pStyle w:val="FirstParagraph"/>
       </w:pPr>
       <w:r>
-        <w:t xml:space="preserve">[1] Moreno-Arjonilla et al.,</w:t>
+        <w:t xml:space="preserve">[1] J. Moreno-Arjonilla, A. Lopez-Ruiz, J. R. Jimenez-Perez, J. E. Callejas-Aguilera, and J. M. Jurado,</w:t>
       </w:r>
       <w:r>
         <w:t xml:space="preserve"> </w:t>
       </w:r>
       <w:r>
-        <w:t xml:space="preserve">“Eye-tracking on Virtual Reality: A Survey,”</w:t>
+        <w:t xml:space="preserve">“Eye-tracking on virtual reality: a survey,”</w:t>
       </w:r>
       <w:r>
         <w:t xml:space="preserve"> </w:t>
@@ -2325,7 +1985,7 @@
         <w:t xml:space="preserve">Virtual Reality</w:t>
       </w:r>
       <w:r>
-        <w:t xml:space="preserve">, 2024.</w:t>
+        <w:t xml:space="preserve">, vol. 28, article 38, 2024, doi: 10.1007/s10055-023-00903-y.</w:t>
       </w:r>
     </w:p>
     <w:p>
@@ -2333,13 +1993,13 @@
         <w:pStyle w:val="BodyText"/>
       </w:pPr>
       <w:r>
-        <w:t xml:space="preserve">[2] Long et al.,</w:t>
+        <w:t xml:space="preserve">[2] S. Pastel, C.-H. Chen, L. Martin, M. Naujoks, K. Petri, and K. Witte,</w:t>
       </w:r>
       <w:r>
         <w:t xml:space="preserve"> </w:t>
       </w:r>
       <w:r>
-        <w:t xml:space="preserve">“Multimodal Detection of External and Internal Attention in Virtual Reality using EEG and Eye Tracking,”</w:t>
+        <w:t xml:space="preserve">“Comparison of gaze accuracy and precision in real-world and virtual reality,”</w:t>
       </w:r>
       <w:r>
         <w:t xml:space="preserve"> </w:t>
@@ -2349,10 +2009,10 @@
           <w:i/>
           <w:iCs/>
         </w:rPr>
-        <w:t xml:space="preserve">MuC</w:t>
-      </w:r>
-      <w:r>
-        <w:t xml:space="preserve">, 2024.</w:t>
+        <w:t xml:space="preserve">Virtual Reality</w:t>
+      </w:r>
+      <w:r>
+        <w:t xml:space="preserve">, vol. 25, pp. 175-189, 2021, doi: 10.1007/s10055-020-00449-3.</w:t>
       </w:r>
     </w:p>
     <w:p>
@@ -2360,13 +2020,19 @@
         <w:pStyle w:val="BodyText"/>
       </w:pPr>
       <w:r>
-        <w:t xml:space="preserve">[3]</w:t>
+        <w:t xml:space="preserve">[3] X. Long, S. Mayer, and F. Chiossi,</w:t>
       </w:r>
       <w:r>
         <w:t xml:space="preserve"> </w:t>
       </w:r>
       <w:r>
-        <w:t xml:space="preserve">“Comparison of Gaze Accuracy and Precision in Real-World and Virtual Reality,”</w:t>
+        <w:t xml:space="preserve">“Multimodal Detection of External and Internal Attention in Virtual Reality using EEG and Eye Tracking Features,”</w:t>
+      </w:r>
+      <w:r>
+        <w:t xml:space="preserve"> </w:t>
+      </w:r>
+      <w:r>
+        <w:t xml:space="preserve">in</w:t>
       </w:r>
       <w:r>
         <w:t xml:space="preserve"> </w:t>
@@ -2376,10 +2042,10 @@
           <w:i/>
           <w:iCs/>
         </w:rPr>
-        <w:t xml:space="preserve">Virtual Reality Journal</w:t>
-      </w:r>
-      <w:r>
-        <w:t xml:space="preserve">, 2020.</w:t>
+        <w:t xml:space="preserve">Proceedings of Mensch und Computer 2024 (MuC ’24)</w:t>
+      </w:r>
+      <w:r>
+        <w:t xml:space="preserve">, 2024, doi: 10.1145/3670653.3670657.</w:t>
       </w:r>
     </w:p>
     <w:p>
@@ -2387,13 +2053,13 @@
         <w:pStyle w:val="BodyText"/>
       </w:pPr>
       <w:r>
-        <w:t xml:space="preserve">[4] Rakkolainen et al.,</w:t>
+        <w:t xml:space="preserve">[4] I. Rakkolainen, A. Farooq, J. Kangas, J. Hakulinen, J. Rantala, M. Turunen, and R. Raisamo,</w:t>
       </w:r>
       <w:r>
         <w:t xml:space="preserve"> </w:t>
       </w:r>
       <w:r>
-        <w:t xml:space="preserve">“Technologies for Multimodal Interaction in Extended Reality–A Scoping Review,”</w:t>
+        <w:t xml:space="preserve">“Technologies for multimodal interaction in extended reality: a scoping review,”</w:t>
       </w:r>
       <w:r>
         <w:t xml:space="preserve"> </w:t>
@@ -2406,7 +2072,7 @@
         <w:t xml:space="preserve">Multimodal Technologies and Interaction</w:t>
       </w:r>
       <w:r>
-        <w:t xml:space="preserve">, 2021.</w:t>
+        <w:t xml:space="preserve">, vol. 5, no. 12, article 81, 2021, doi: 10.3390/mti5120081.</w:t>
       </w:r>
     </w:p>
     <w:p>
@@ -2414,13 +2080,40 @@
         <w:pStyle w:val="BodyText"/>
       </w:pPr>
       <w:r>
-        <w:t xml:space="preserve">[5] Bustamante et al.,</w:t>
+        <w:t xml:space="preserve">[5] H. Kim, S. Lee, and C. Kang,</w:t>
       </w:r>
       <w:r>
         <w:t xml:space="preserve"> </w:t>
       </w:r>
       <w:r>
-        <w:t xml:space="preserve">“Skeleton-Based Posture Recognition for Home Care,”</w:t>
+        <w:t xml:space="preserve">“From controllers to multimodal input: a chronological review of XR interaction across device generations,”</w:t>
+      </w:r>
+      <w:r>
+        <w:t xml:space="preserve"> </w:t>
+      </w:r>
+      <w:r>
+        <w:rPr>
+          <w:i/>
+          <w:iCs/>
+        </w:rPr>
+        <w:t xml:space="preserve">Sensors</w:t>
+      </w:r>
+      <w:r>
+        <w:t xml:space="preserve">, vol. 26, no. 1, article 196, 2026, doi: 10.3390/s26010196.</w:t>
+      </w:r>
+    </w:p>
+    <w:p>
+      <w:pPr>
+        <w:pStyle w:val="BodyText"/>
+      </w:pPr>
+      <w:r>
+        <w:t xml:space="preserve">[6] A. Bustamante, L. M. Belmonte, A. Pereira, R. Morales, and A. Fernandez-Caballero,</w:t>
+      </w:r>
+      <w:r>
+        <w:t xml:space="preserve"> </w:t>
+      </w:r>
+      <w:r>
+        <w:t xml:space="preserve">“Skeleton-based posture recognition for home care from virtual unmanned aerial vehicle,”</w:t>
       </w:r>
       <w:r>
         <w:t xml:space="preserve"> </w:t>
@@ -2433,7 +2126,7 @@
         <w:t xml:space="preserve">Expert Systems</w:t>
       </w:r>
       <w:r>
-        <w:t xml:space="preserve">, 2025.</w:t>
+        <w:t xml:space="preserve">, 2025, doi: 10.1111/exsy.70108.</w:t>
       </w:r>
     </w:p>
     <w:p>
@@ -2441,26 +2134,19 @@
         <w:pStyle w:val="BodyText"/>
       </w:pPr>
       <w:r>
-        <w:t xml:space="preserve">[6] Neidhardt et al.,</w:t>
+        <w:t xml:space="preserve">[7] M. Neidhardt, S. Gerlach, F. N. Schmidt, I. A. K. Fiedler, S. Grube, B. Busse, and A. Schlaefer,</w:t>
       </w:r>
       <w:r>
         <w:t xml:space="preserve"> </w:t>
       </w:r>
       <w:r>
-        <w:t xml:space="preserve">“VR-based Body Tracking to Stimulate Musculoskeletal Training,”</w:t>
+        <w:t xml:space="preserve">“VR-based body tracking to stimulate musculoskeletal training,”</w:t>
       </w:r>
       <w:r>
         <w:t xml:space="preserve"> </w:t>
       </w:r>
       <w:r>
-        <w:rPr>
-          <w:i/>
-          <w:iCs/>
-        </w:rPr>
-        <w:t xml:space="preserve">arXiv</w:t>
-      </w:r>
-      <w:r>
-        <w:t xml:space="preserve">, 2023.</w:t>
+        <w:t xml:space="preserve">arXiv:2308.03375, 2023.</w:t>
       </w:r>
     </w:p>
     <w:p>
@@ -2468,94 +2154,13 @@
         <w:pStyle w:val="BodyText"/>
       </w:pPr>
       <w:r>
-        <w:t xml:space="preserve">[7] Davari and Bowman,</w:t>
+        <w:t xml:space="preserve">[8] Y. Lei, Y. Deng, L. Dong, X. Li, X. Li, and Z. Su,</w:t>
       </w:r>
       <w:r>
         <w:t xml:space="preserve"> </w:t>
       </w:r>
       <w:r>
-        <w:t xml:space="preserve">“Towards Context-Aware Adaptation in Extended Reality,”</w:t>
-      </w:r>
-      <w:r>
-        <w:t xml:space="preserve"> </w:t>
-      </w:r>
-      <w:r>
-        <w:rPr>
-          <w:i/>
-          <w:iCs/>
-        </w:rPr>
-        <w:t xml:space="preserve">arXiv</w:t>
-      </w:r>
-      <w:r>
-        <w:t xml:space="preserve">, 2024.</w:t>
-      </w:r>
-    </w:p>
-    <w:p>
-      <w:pPr>
-        <w:pStyle w:val="BodyText"/>
-      </w:pPr>
-      <w:r>
-        <w:t xml:space="preserve">[8] Kim et al.,</w:t>
-      </w:r>
-      <w:r>
-        <w:t xml:space="preserve"> </w:t>
-      </w:r>
-      <w:r>
-        <w:t xml:space="preserve">“From Controllers to Multimodal Input: XR Interaction Evolution,”</w:t>
-      </w:r>
-      <w:r>
-        <w:t xml:space="preserve"> </w:t>
-      </w:r>
-      <w:r>
-        <w:rPr>
-          <w:i/>
-          <w:iCs/>
-        </w:rPr>
-        <w:t xml:space="preserve">Sensors</w:t>
-      </w:r>
-      <w:r>
-        <w:t xml:space="preserve">, 2026.</w:t>
-      </w:r>
-    </w:p>
-    <w:p>
-      <w:pPr>
-        <w:pStyle w:val="BodyText"/>
-      </w:pPr>
-      <w:r>
-        <w:t xml:space="preserve">[9] Ramiotis and Mania,</w:t>
-      </w:r>
-      <w:r>
-        <w:t xml:space="preserve"> </w:t>
-      </w:r>
-      <w:r>
-        <w:t xml:space="preserve">“CONTEXT-GAD: Context-Aware Gaze Adaptive Dwell Model,”</w:t>
-      </w:r>
-      <w:r>
-        <w:t xml:space="preserve"> </w:t>
-      </w:r>
-      <w:r>
-        <w:rPr>
-          <w:i/>
-          <w:iCs/>
-        </w:rPr>
-        <w:t xml:space="preserve">VRST</w:t>
-      </w:r>
-      <w:r>
-        <w:t xml:space="preserve">, 2025.</w:t>
-      </w:r>
-    </w:p>
-    <w:p>
-      <w:pPr>
-        <w:pStyle w:val="BodyText"/>
-      </w:pPr>
-      <w:r>
-        <w:t xml:space="preserve">[10] Lei et al.,</w:t>
-      </w:r>
-      <w:r>
-        <w:t xml:space="preserve"> </w:t>
-      </w:r>
-      <w:r>
-        <w:t xml:space="preserve">“A Novel Sensor Fusion Approach for Precise Hand Tracking in VR,”</w:t>
+        <w:t xml:space="preserve">“A novel sensor fusion approach for precise hand tracking in virtual reality-based human-computer interaction,”</w:t>
       </w:r>
       <w:r>
         <w:t xml:space="preserve"> </w:t>
@@ -2568,7 +2173,7 @@
         <w:t xml:space="preserve">Biomimetics</w:t>
       </w:r>
       <w:r>
-        <w:t xml:space="preserve">, 2023.</w:t>
+        <w:t xml:space="preserve">, vol. 8, no. 3, article 326, 2023, doi: 10.3390/biomimetics8030326.</w:t>
       </w:r>
     </w:p>
     <w:p>
@@ -2576,13 +2181,13 @@
         <w:pStyle w:val="BodyText"/>
       </w:pPr>
       <w:r>
-        <w:t xml:space="preserve">[11] Selaskowski et al.,</w:t>
+        <w:t xml:space="preserve">[9] B. Selaskowski et al.,</w:t>
       </w:r>
       <w:r>
         <w:t xml:space="preserve"> </w:t>
       </w:r>
       <w:r>
-        <w:t xml:space="preserve">“Gaze-based Attention Refocusing Training in VR for ADHD,”</w:t>
+        <w:t xml:space="preserve">“Gaze-based attention refocusing training in virtual reality for adult attention-deficit/hyperactivity disorder,”</w:t>
       </w:r>
       <w:r>
         <w:t xml:space="preserve"> </w:t>
@@ -2595,16 +2200,67 @@
         <w:t xml:space="preserve">BMC Psychiatry</w:t>
       </w:r>
       <w:r>
-        <w:t xml:space="preserve">, 2023.</w:t>
-      </w:r>
-    </w:p>
-    <w:bookmarkEnd w:id="36"/>
+        <w:t xml:space="preserve">, vol. 23, article 74, 2023, doi: 10.1186/s12888-023-04551-z.</w:t>
+      </w:r>
+    </w:p>
+    <w:p>
+      <w:pPr>
+        <w:pStyle w:val="BodyText"/>
+      </w:pPr>
+      <w:r>
+        <w:t xml:space="preserve">[10] S. Davari and D. A. Bowman,</w:t>
+      </w:r>
+      <w:r>
+        <w:t xml:space="preserve"> </w:t>
+      </w:r>
+      <w:r>
+        <w:t xml:space="preserve">“Towards context-aware adaptation in extended reality: a design space for XR interfaces and an adaptive placement strategy,”</w:t>
+      </w:r>
+      <w:r>
+        <w:t xml:space="preserve"> </w:t>
+      </w:r>
+      <w:r>
+        <w:t xml:space="preserve">arXiv:2411.02607, 2024, doi: 10.48550/arXiv.2411.02607.</w:t>
+      </w:r>
+    </w:p>
+    <w:p>
+      <w:pPr>
+        <w:pStyle w:val="BodyText"/>
+      </w:pPr>
+      <w:r>
+        <w:t xml:space="preserve">[11] G. Ramiotis and K. Mania,</w:t>
+      </w:r>
+      <w:r>
+        <w:t xml:space="preserve"> </w:t>
+      </w:r>
+      <w:r>
+        <w:t xml:space="preserve">“CONTEXT-GAD: a context-aware gaze adaptive dwell model for gaze-based selections in XR environments,”</w:t>
+      </w:r>
+      <w:r>
+        <w:t xml:space="preserve"> </w:t>
+      </w:r>
+      <w:r>
+        <w:t xml:space="preserve">in</w:t>
+      </w:r>
+      <w:r>
+        <w:t xml:space="preserve"> </w:t>
+      </w:r>
+      <w:r>
+        <w:rPr>
+          <w:i/>
+          <w:iCs/>
+        </w:rPr>
+        <w:t xml:space="preserve">Proceedings of the 31st ACM Symposium on Virtual Reality Software and Technology (VRST ’25)</w:t>
+      </w:r>
+      <w:r>
+        <w:t xml:space="preserve">, 2025, doi: 10.1145/3756884.3766048.</w:t>
+      </w:r>
+    </w:p>
+    <w:bookmarkEnd w:id="41"/>
     <w:sectPr>
       <w:footnotePr>
         <w:numRestart w:val="eachSect"/>
       </w:footnotePr>
-      <w:pgSz w:w="12240" w:h="15840"/>
-      <w:pgMar w:top="1080" w:bottom="1080" w:left="1080" w:right="1080"/>
     </w:sectPr>
   </w:body>
 </w:document>
@@ -2968,10 +2624,6 @@
   <w:style w:default="1" w:styleId="Normal" w:type="paragraph">
     <w:name w:val="Normal"/>
     <w:qFormat/>
-    <w:rPr>
-      <w:rFonts w:ascii="Calibri" w:hAnsi="Calibri"/>
-      <w:sz w:val="21"/>
-    </w:rPr>
   </w:style>
   <w:style w:styleId="BodyText" w:type="paragraph">
     <w:name w:val="Body Text"/>
@@ -3010,10 +2662,8 @@
       <w:jc w:val="center"/>
     </w:pPr>
     <w:rPr>
-      <w:rFonts w:asciiTheme="majorHAnsi" w:cstheme="majorBidi" w:eastAsiaTheme="majorEastAsia" w:hAnsiTheme="majorHAnsi" w:ascii="Calibri" w:hAnsi="Calibri"/>
-      <w:b/>
-      <w:color w:val="142D3C"/>
-      <w:sz w:val="40"/>
+      <w:rFonts w:asciiTheme="majorHAnsi" w:cstheme="majorBidi" w:eastAsiaTheme="majorEastAsia" w:hAnsiTheme="majorHAnsi"/>
+      <w:sz w:val="56"/>
       <w:szCs w:val="56"/>
     </w:rPr>
   </w:style>
@@ -3146,10 +2796,9 @@
       <w:outlineLvl w:val="0"/>
     </w:pPr>
     <w:rPr>
-      <w:rFonts w:asciiTheme="majorHAnsi" w:cstheme="majorBidi" w:eastAsiaTheme="majorEastAsia" w:hAnsiTheme="majorHAnsi" w:ascii="Calibri" w:hAnsi="Calibri"/>
-      <w:b/>
-      <w:color w:val="006C82"/>
-      <w:sz w:val="30"/>
+      <w:rFonts w:asciiTheme="majorHAnsi" w:cstheme="majorBidi" w:eastAsiaTheme="majorEastAsia" w:hAnsiTheme="majorHAnsi"/>
+      <w:color w:themeColor="accent1" w:themeShade="BF" w:val="0F4761"/>
+      <w:sz w:val="40"/>
       <w:szCs w:val="40"/>
     </w:rPr>
   </w:style>
@@ -3170,10 +2819,9 @@
       <w:outlineLvl w:val="1"/>
     </w:pPr>
     <w:rPr>
-      <w:rFonts w:asciiTheme="majorHAnsi" w:cstheme="majorBidi" w:eastAsiaTheme="majorEastAsia" w:hAnsiTheme="majorHAnsi" w:ascii="Calibri" w:hAnsi="Calibri"/>
-      <w:b/>
-      <w:color w:val="144150"/>
-      <w:sz w:val="25"/>
+      <w:rFonts w:asciiTheme="majorHAnsi" w:cstheme="majorBidi" w:eastAsiaTheme="majorEastAsia" w:hAnsiTheme="majorHAnsi"/>
+      <w:color w:themeColor="accent1" w:themeShade="BF" w:val="0F4761"/>
+      <w:sz w:val="32"/>
       <w:szCs w:val="32"/>
     </w:rPr>
   </w:style>
@@ -3194,10 +2842,9 @@
       <w:outlineLvl w:val="2"/>
     </w:pPr>
     <w:rPr>
-      <w:rFonts w:cstheme="majorBidi" w:eastAsiaTheme="majorEastAsia" w:ascii="Calibri" w:hAnsi="Calibri"/>
-      <w:b/>
-      <w:color w:val="2D4B55"/>
-      <w:sz w:val="23"/>
+      <w:rFonts w:cstheme="majorBidi" w:eastAsiaTheme="majorEastAsia"/>
+      <w:color w:themeColor="accent1" w:themeShade="BF" w:val="0F4761"/>
+      <w:sz w:val="28"/>
       <w:szCs w:val="28"/>
     </w:rPr>
   </w:style>

</xml_diff>